<commit_message>
almost done actually added the plan docx this time
</commit_message>
<xml_diff>
--- a/BPE Tokenizer plan.docx
+++ b/BPE Tokenizer plan.docx
@@ -140,7 +140,7 @@
       <w:r>
         <w:rPr/>
         <w:pict>
-          <v:rect style="width:0;height:2" o:hralign="center" o:hrstd="t" o:hr="t" fillcolor="A0A0A0" stroked="f"/>
+          <v:rect style="width:0;height:0" o:hralign="center" o:hrstd="t" o:hr="t" fillcolor="A0A0A0" stroked="f"/>
         </w:pict>
       </w:r>
     </w:p>
@@ -375,7 +375,7 @@
       <w:r>
         <w:rPr/>
         <w:pict>
-          <v:rect style="width:0;height:2" o:hralign="center" o:hrstd="t" o:hr="t" fillcolor="A0A0A0" stroked="f"/>
+          <v:rect style="width:0;height:0" o:hralign="center" o:hrstd="t" o:hr="t" fillcolor="A0A0A0" stroked="f"/>
         </w:pict>
       </w:r>
     </w:p>
@@ -991,7 +991,7 @@
       <w:r>
         <w:rPr/>
         <w:pict>
-          <v:rect style="width:0;height:2" o:hralign="center" o:hrstd="t" o:hr="t" fillcolor="A0A0A0" stroked="f"/>
+          <v:rect style="width:0;height:0" o:hralign="center" o:hrstd="t" o:hr="t" fillcolor="A0A0A0" stroked="f"/>
         </w:pict>
       </w:r>
     </w:p>
@@ -1814,7 +1814,7 @@
       <w:r>
         <w:rPr/>
         <w:pict>
-          <v:rect style="width:0;height:2" o:hralign="center" o:hrstd="t" o:hr="t" fillcolor="A0A0A0" stroked="f"/>
+          <v:rect style="width:0;height:0" o:hralign="center" o:hrstd="t" o:hr="t" fillcolor="A0A0A0" stroked="f"/>
         </w:pict>
       </w:r>
     </w:p>
@@ -3722,7 +3722,7 @@
       <w:r>
         <w:rPr/>
         <w:pict>
-          <v:rect style="width:0;height:2" o:hralign="center" o:hrstd="t" o:hr="t" fillcolor="A0A0A0" stroked="f"/>
+          <v:rect style="width:0;height:0" o:hralign="center" o:hrstd="t" o:hr="t" fillcolor="A0A0A0" stroked="f"/>
         </w:pict>
       </w:r>
     </w:p>
@@ -4172,7 +4172,7 @@
       <w:r>
         <w:rPr/>
         <w:pict>
-          <v:rect style="width:0;height:2" o:hralign="center" o:hrstd="t" o:hr="t" fillcolor="A0A0A0" stroked="f"/>
+          <v:rect style="width:0;height:0" o:hralign="center" o:hrstd="t" o:hr="t" fillcolor="A0A0A0" stroked="f"/>
         </w:pict>
       </w:r>
     </w:p>
@@ -4914,7 +4914,7 @@
       <w:r>
         <w:rPr/>
         <w:pict>
-          <v:rect style="width:0;height:2" o:hralign="center" o:hrstd="t" o:hr="t" fillcolor="A0A0A0" stroked="f"/>
+          <v:rect style="width:0;height:0" o:hralign="center" o:hrstd="t" o:hr="t" fillcolor="A0A0A0" stroked="f"/>
         </w:pict>
       </w:r>
     </w:p>
@@ -5147,7 +5147,7 @@
       <w:r>
         <w:rPr/>
         <w:pict>
-          <v:rect style="width:0;height:2" o:hralign="center" o:hrstd="t" o:hr="t" fillcolor="A0A0A0" stroked="f"/>
+          <v:rect style="width:0;height:0" o:hralign="center" o:hrstd="t" o:hr="t" fillcolor="A0A0A0" stroked="f"/>
         </w:pict>
       </w:r>
     </w:p>
@@ -5565,7 +5565,7 @@
       <w:r>
         <w:rPr/>
         <w:pict>
-          <v:rect style="width:0;height:2" o:hralign="center" o:hrstd="t" o:hr="t" fillcolor="A0A0A0" stroked="f"/>
+          <v:rect style="width:0;height:0" o:hralign="center" o:hrstd="t" o:hr="t" fillcolor="A0A0A0" stroked="f"/>
         </w:pict>
       </w:r>
     </w:p>
@@ -5792,7 +5792,7 @@
       <w:r>
         <w:rPr/>
         <w:pict>
-          <v:rect style="width:0;height:2" o:hralign="center" o:hrstd="t" o:hr="t" fillcolor="A0A0A0" stroked="f"/>
+          <v:rect style="width:0;height:0" o:hralign="center" o:hrstd="t" o:hr="t" fillcolor="A0A0A0" stroked="f"/>
         </w:pict>
       </w:r>
     </w:p>
@@ -5869,7 +5869,7 @@
       <w:r>
         <w:rPr/>
         <w:pict>
-          <v:rect style="width:0;height:2" o:hralign="center" o:hrstd="t" o:hr="t" fillcolor="A0A0A0" stroked="f"/>
+          <v:rect style="width:0;height:0" o:hralign="center" o:hrstd="t" o:hr="t" fillcolor="A0A0A0" stroked="f"/>
         </w:pict>
       </w:r>
     </w:p>
@@ -6145,7 +6145,7 @@
       <w:r>
         <w:rPr/>
         <w:pict>
-          <v:rect style="width:0;height:2" o:hralign="center" o:hrstd="t" o:hr="t" fillcolor="A0A0A0" stroked="f"/>
+          <v:rect style="width:0;height:0" o:hralign="center" o:hrstd="t" o:hr="t" fillcolor="A0A0A0" stroked="f"/>
         </w:pict>
       </w:r>
     </w:p>
@@ -6624,7 +6624,7 @@
       <w:r>
         <w:rPr/>
         <w:pict>
-          <v:rect style="width:0;height:2" o:hralign="center" o:hrstd="t" o:hr="t" fillcolor="A0A0A0" stroked="f"/>
+          <v:rect style="width:0;height:0" o:hralign="center" o:hrstd="t" o:hr="t" fillcolor="A0A0A0" stroked="f"/>
         </w:pict>
       </w:r>
     </w:p>
@@ -6774,7 +6774,7 @@
       <w:r>
         <w:rPr/>
         <w:pict>
-          <v:rect style="width:0;height:2" o:hralign="center" o:hrstd="t" o:hr="t" fillcolor="A0A0A0" stroked="f"/>
+          <v:rect style="width:0;height:0" o:hralign="center" o:hrstd="t" o:hr="t" fillcolor="A0A0A0" stroked="f"/>
         </w:pict>
       </w:r>
     </w:p>
@@ -6924,7 +6924,7 @@
       <w:r>
         <w:rPr/>
         <w:pict>
-          <v:rect style="width:0;height:2" o:hralign="center" o:hrstd="t" o:hr="t" fillcolor="A0A0A0" stroked="f"/>
+          <v:rect style="width:0;height:0" o:hralign="center" o:hrstd="t" o:hr="t" fillcolor="A0A0A0" stroked="f"/>
         </w:pict>
       </w:r>
     </w:p>
@@ -7153,7 +7153,7 @@
       <w:r>
         <w:rPr/>
         <w:pict>
-          <v:rect style="width:0;height:2" o:hralign="center" o:hrstd="t" o:hr="t" fillcolor="A0A0A0" stroked="f"/>
+          <v:rect style="width:0;height:0" o:hralign="center" o:hrstd="t" o:hr="t" fillcolor="A0A0A0" stroked="f"/>
         </w:pict>
       </w:r>
     </w:p>
@@ -7291,7 +7291,7 @@
       <w:r>
         <w:rPr/>
         <w:pict>
-          <v:rect style="width:0;height:2" o:hralign="center" o:hrstd="t" o:hr="t" fillcolor="A0A0A0" stroked="f"/>
+          <v:rect style="width:0;height:0" o:hralign="center" o:hrstd="t" o:hr="t" fillcolor="A0A0A0" stroked="f"/>
         </w:pict>
       </w:r>
     </w:p>
@@ -7441,7 +7441,7 @@
       <w:r>
         <w:rPr/>
         <w:pict>
-          <v:rect style="width:0;height:2" o:hralign="center" o:hrstd="t" o:hr="t" fillcolor="A0A0A0" stroked="f"/>
+          <v:rect style="width:0;height:0" o:hralign="center" o:hrstd="t" o:hr="t" fillcolor="A0A0A0" stroked="f"/>
         </w:pict>
       </w:r>
     </w:p>
@@ -7579,7 +7579,7 @@
       <w:r>
         <w:rPr/>
         <w:pict>
-          <v:rect style="width:0;height:2" o:hralign="center" o:hrstd="t" o:hr="t" fillcolor="A0A0A0" stroked="f"/>
+          <v:rect style="width:0;height:0" o:hralign="center" o:hrstd="t" o:hr="t" fillcolor="A0A0A0" stroked="f"/>
         </w:pict>
       </w:r>
     </w:p>
@@ -7717,7 +7717,7 @@
       <w:r>
         <w:rPr/>
         <w:pict>
-          <v:rect style="width:0;height:2" o:hralign="center" o:hrstd="t" o:hr="t" fillcolor="A0A0A0" stroked="f"/>
+          <v:rect style="width:0;height:0" o:hralign="center" o:hrstd="t" o:hr="t" fillcolor="A0A0A0" stroked="f"/>
         </w:pict>
       </w:r>
     </w:p>
@@ -7855,7 +7855,7 @@
       <w:r>
         <w:rPr/>
         <w:pict>
-          <v:rect style="width:0;height:2" o:hralign="center" o:hrstd="t" o:hr="t" fillcolor="A0A0A0" stroked="f"/>
+          <v:rect style="width:0;height:0" o:hralign="center" o:hrstd="t" o:hr="t" fillcolor="A0A0A0" stroked="f"/>
         </w:pict>
       </w:r>
     </w:p>
@@ -8017,7 +8017,7 @@
       <w:r>
         <w:rPr/>
         <w:pict>
-          <v:rect style="width:0;height:2" o:hralign="center" o:hrstd="t" o:hr="t" fillcolor="A0A0A0" stroked="f"/>
+          <v:rect style="width:0;height:0" o:hralign="center" o:hrstd="t" o:hr="t" fillcolor="A0A0A0" stroked="f"/>
         </w:pict>
       </w:r>
     </w:p>
@@ -8448,7 +8448,7 @@
       <w:r>
         <w:rPr/>
         <w:pict>
-          <v:rect style="width:0;height:2" o:hralign="center" o:hrstd="t" o:hr="t" fillcolor="A0A0A0" stroked="f"/>
+          <v:rect style="width:0;height:0" o:hralign="center" o:hrstd="t" o:hr="t" fillcolor="A0A0A0" stroked="f"/>
         </w:pict>
       </w:r>
     </w:p>

</xml_diff>